<commit_message>
fix(report): ensure strict OpenXML element ordering in Bao_Cao_Khoa_Luan.docx for Word compatibility
</commit_message>
<xml_diff>
--- a/Mô tả nghiệp vụ.docx
+++ b/Mô tả nghiệp vụ.docx
@@ -157,7 +157,40 @@
           <w:sz w:val="26"/>
           <w:szCs w:val="26"/>
         </w:rPr>
-        <w:t>Cán bộ xét duyệt (Hội đồng / Phòng KH&amp;CN):</w:t>
+        <w:t>Cán bộ xét duyệt (</w:t>
+      </w:r>
+      <w:r>
+        <w:rPr>
+          <w:rFonts w:asciiTheme="majorHAnsi" w:hAnsiTheme="majorHAnsi" w:cstheme="majorHAnsi"/>
+          <w:b/>
+          <w:bCs/>
+          <w:color w:val="C00000"/>
+          <w:sz w:val="26"/>
+          <w:szCs w:val="26"/>
+          <w:lang w:val="en-US"/>
+        </w:rPr>
+        <w:t>Đơn vị quản lý</w:t>
+      </w:r>
+      <w:r>
+        <w:rPr>
+          <w:rFonts w:asciiTheme="majorHAnsi" w:hAnsiTheme="majorHAnsi" w:cstheme="majorHAnsi"/>
+          <w:b/>
+          <w:bCs/>
+          <w:color w:val="C00000"/>
+          <w:sz w:val="26"/>
+          <w:szCs w:val="26"/>
+        </w:rPr>
+        <w:t xml:space="preserve"> </w:t>
+      </w:r>
+      <w:r>
+        <w:rPr>
+          <w:rFonts w:asciiTheme="majorHAnsi" w:hAnsiTheme="majorHAnsi" w:cstheme="majorHAnsi"/>
+          <w:b/>
+          <w:bCs/>
+          <w:sz w:val="26"/>
+          <w:szCs w:val="26"/>
+        </w:rPr>
+        <w:t>/ Phòng KH&amp;CN):</w:t>
       </w:r>
       <w:r>
         <w:rPr>
@@ -1371,6 +1404,7 @@
           <w:rFonts w:asciiTheme="majorHAnsi" w:hAnsiTheme="majorHAnsi" w:cstheme="majorHAnsi"/>
           <w:sz w:val="26"/>
           <w:szCs w:val="26"/>
+          <w:lang w:val="en-US"/>
         </w:rPr>
       </w:pPr>
       <w:r>
@@ -1398,6 +1432,118 @@
           <w:szCs w:val="26"/>
         </w:rPr>
         <w:t xml:space="preserve"> Có full quyền (CRUD) trên toàn bộ danh mục hồ sơ của tất cả đơn vị trong trường.</w:t>
+      </w:r>
+    </w:p>
+    <w:p>
+      <w:pPr>
+        <w:ind w:left="1701"/>
+        <w:rPr>
+          <w:rFonts w:asciiTheme="majorHAnsi" w:hAnsiTheme="majorHAnsi" w:cstheme="majorHAnsi"/>
+          <w:color w:val="EE0000"/>
+          <w:sz w:val="26"/>
+          <w:szCs w:val="26"/>
+          <w:lang w:val="en-US"/>
+        </w:rPr>
+      </w:pPr>
+      <w:r>
+        <w:rPr>
+          <w:rFonts w:asciiTheme="majorHAnsi" w:hAnsiTheme="majorHAnsi" w:cstheme="majorHAnsi"/>
+          <w:color w:val="EE0000"/>
+          <w:sz w:val="26"/>
+          <w:szCs w:val="26"/>
+          <w:lang w:val="en-US"/>
+        </w:rPr>
+        <w:sym w:font="Wingdings" w:char="F0E8"/>
+      </w:r>
+      <w:r>
+        <w:rPr>
+          <w:rFonts w:asciiTheme="majorHAnsi" w:hAnsiTheme="majorHAnsi" w:cstheme="majorHAnsi"/>
+          <w:color w:val="EE0000"/>
+          <w:sz w:val="26"/>
+          <w:szCs w:val="26"/>
+          <w:lang w:val="en-US"/>
+        </w:rPr>
+        <w:t xml:space="preserve">  Nghiệp vụ quản lý hồ sơ nên tập trung vào 2 mảng </w:t>
+      </w:r>
+      <w:r>
+        <w:rPr>
+          <w:rFonts w:asciiTheme="majorHAnsi" w:hAnsiTheme="majorHAnsi" w:cstheme="majorHAnsi"/>
+          <w:color w:val="EE0000"/>
+          <w:sz w:val="26"/>
+          <w:szCs w:val="26"/>
+          <w:lang w:val="en-US"/>
+        </w:rPr>
+        <w:t>chính là bài báo khoa học và đề tài</w:t>
+      </w:r>
+      <w:r>
+        <w:rPr>
+          <w:rFonts w:asciiTheme="majorHAnsi" w:hAnsiTheme="majorHAnsi" w:cstheme="majorHAnsi"/>
+          <w:color w:val="EE0000"/>
+          <w:sz w:val="26"/>
+          <w:szCs w:val="26"/>
+          <w:lang w:val="en-US"/>
+        </w:rPr>
+        <w:t xml:space="preserve"> nghiên cứu khoa học</w:t>
+      </w:r>
+    </w:p>
+    <w:p>
+      <w:pPr>
+        <w:pStyle w:val="ListParagraph"/>
+        <w:numPr>
+          <w:ilvl w:val="2"/>
+          <w:numId w:val="3"/>
+        </w:numPr>
+        <w:rPr>
+          <w:rFonts w:asciiTheme="majorHAnsi" w:hAnsiTheme="majorHAnsi" w:cstheme="majorHAnsi"/>
+          <w:color w:val="EE0000"/>
+          <w:sz w:val="26"/>
+          <w:szCs w:val="26"/>
+          <w:lang w:val="en-US"/>
+        </w:rPr>
+      </w:pPr>
+      <w:r>
+        <w:rPr>
+          <w:rFonts w:asciiTheme="majorHAnsi" w:hAnsiTheme="majorHAnsi" w:cstheme="majorHAnsi"/>
+          <w:color w:val="EE0000"/>
+          <w:sz w:val="26"/>
+          <w:szCs w:val="26"/>
+          <w:lang w:val="en-US"/>
+        </w:rPr>
+        <w:t>Đối với bài báo các trường thông tin cần có: T</w:t>
+      </w:r>
+      <w:r>
+        <w:rPr>
+          <w:rFonts w:asciiTheme="majorHAnsi" w:hAnsiTheme="majorHAnsi" w:cstheme="majorHAnsi"/>
+          <w:color w:val="EE0000"/>
+          <w:sz w:val="26"/>
+          <w:szCs w:val="26"/>
+        </w:rPr>
+        <w:t>ên tạp chí/hội thảo, ISSN, DOI, năm công bố, tập, số, trang, chỉ mục và minh chứng công bố.</w:t>
+      </w:r>
+    </w:p>
+    <w:p>
+      <w:pPr>
+        <w:pStyle w:val="ListParagraph"/>
+        <w:numPr>
+          <w:ilvl w:val="2"/>
+          <w:numId w:val="3"/>
+        </w:numPr>
+        <w:rPr>
+          <w:rFonts w:asciiTheme="majorHAnsi" w:hAnsiTheme="majorHAnsi" w:cstheme="majorHAnsi"/>
+          <w:color w:val="EE0000"/>
+          <w:sz w:val="26"/>
+          <w:szCs w:val="26"/>
+          <w:lang w:val="en-US"/>
+        </w:rPr>
+      </w:pPr>
+      <w:r>
+        <w:rPr>
+          <w:rFonts w:asciiTheme="majorHAnsi" w:hAnsiTheme="majorHAnsi" w:cstheme="majorHAnsi"/>
+          <w:color w:val="EE0000"/>
+          <w:sz w:val="26"/>
+          <w:szCs w:val="26"/>
+        </w:rPr>
+        <w:t>Đối với đề tài NCKH, bổ sung thông tin mã đề tài, cấp đề tài, chủ nhiệm, thành viên, đơn vị chủ trì, thời gian thực hiện, kinh phí và sản phẩm dự kiến.</w:t>
       </w:r>
     </w:p>
     <w:p>
@@ -1427,15 +1573,17 @@
         </w:numPr>
         <w:rPr>
           <w:rFonts w:asciiTheme="majorHAnsi" w:hAnsiTheme="majorHAnsi" w:cstheme="majorHAnsi"/>
-          <w:sz w:val="26"/>
-          <w:szCs w:val="26"/>
-        </w:rPr>
-      </w:pPr>
-      <w:r>
-        <w:rPr>
-          <w:rFonts w:asciiTheme="majorHAnsi" w:hAnsiTheme="majorHAnsi" w:cstheme="majorHAnsi"/>
-          <w:b/>
-          <w:bCs/>
+          <w:color w:val="000000" w:themeColor="text1"/>
+          <w:sz w:val="26"/>
+          <w:szCs w:val="26"/>
+        </w:rPr>
+      </w:pPr>
+      <w:r>
+        <w:rPr>
+          <w:rFonts w:asciiTheme="majorHAnsi" w:hAnsiTheme="majorHAnsi" w:cstheme="majorHAnsi"/>
+          <w:b/>
+          <w:bCs/>
+          <w:color w:val="000000" w:themeColor="text1"/>
           <w:sz w:val="26"/>
           <w:szCs w:val="26"/>
         </w:rPr>
@@ -1444,6 +1592,7 @@
       <w:r>
         <w:rPr>
           <w:rFonts w:asciiTheme="majorHAnsi" w:hAnsiTheme="majorHAnsi" w:cstheme="majorHAnsi"/>
+          <w:color w:val="000000" w:themeColor="text1"/>
           <w:sz w:val="26"/>
           <w:szCs w:val="26"/>
         </w:rPr>
@@ -1458,15 +1607,17 @@
         </w:numPr>
         <w:rPr>
           <w:rFonts w:asciiTheme="majorHAnsi" w:hAnsiTheme="majorHAnsi" w:cstheme="majorHAnsi"/>
-          <w:sz w:val="26"/>
-          <w:szCs w:val="26"/>
-        </w:rPr>
-      </w:pPr>
-      <w:r>
-        <w:rPr>
-          <w:rFonts w:asciiTheme="majorHAnsi" w:hAnsiTheme="majorHAnsi" w:cstheme="majorHAnsi"/>
-          <w:b/>
-          <w:bCs/>
+          <w:color w:val="000000" w:themeColor="text1"/>
+          <w:sz w:val="26"/>
+          <w:szCs w:val="26"/>
+        </w:rPr>
+      </w:pPr>
+      <w:r>
+        <w:rPr>
+          <w:rFonts w:asciiTheme="majorHAnsi" w:hAnsiTheme="majorHAnsi" w:cstheme="majorHAnsi"/>
+          <w:b/>
+          <w:bCs/>
+          <w:color w:val="000000" w:themeColor="text1"/>
           <w:sz w:val="26"/>
           <w:szCs w:val="26"/>
         </w:rPr>
@@ -1475,6 +1626,7 @@
       <w:r>
         <w:rPr>
           <w:rFonts w:asciiTheme="majorHAnsi" w:hAnsiTheme="majorHAnsi" w:cstheme="majorHAnsi"/>
+          <w:color w:val="000000" w:themeColor="text1"/>
           <w:sz w:val="26"/>
           <w:szCs w:val="26"/>
         </w:rPr>
@@ -1489,23 +1641,27 @@
         </w:numPr>
         <w:rPr>
           <w:rFonts w:asciiTheme="majorHAnsi" w:hAnsiTheme="majorHAnsi" w:cstheme="majorHAnsi"/>
-          <w:sz w:val="26"/>
-          <w:szCs w:val="26"/>
-        </w:rPr>
-      </w:pPr>
-      <w:r>
-        <w:rPr>
-          <w:rFonts w:asciiTheme="majorHAnsi" w:hAnsiTheme="majorHAnsi" w:cstheme="majorHAnsi"/>
-          <w:b/>
-          <w:bCs/>
-          <w:sz w:val="26"/>
-          <w:szCs w:val="26"/>
-        </w:rPr>
+          <w:color w:val="000000" w:themeColor="text1"/>
+          <w:sz w:val="26"/>
+          <w:szCs w:val="26"/>
+        </w:rPr>
+      </w:pPr>
+      <w:r>
+        <w:rPr>
+          <w:rFonts w:asciiTheme="majorHAnsi" w:hAnsiTheme="majorHAnsi" w:cstheme="majorHAnsi"/>
+          <w:b/>
+          <w:bCs/>
+          <w:color w:val="000000" w:themeColor="text1"/>
+          <w:sz w:val="26"/>
+          <w:szCs w:val="26"/>
+        </w:rPr>
+        <w:lastRenderedPageBreak/>
         <w:t>Đối tượng danh mục:</w:t>
       </w:r>
       <w:r>
         <w:rPr>
           <w:rFonts w:asciiTheme="majorHAnsi" w:hAnsiTheme="majorHAnsi" w:cstheme="majorHAnsi"/>
+          <w:color w:val="000000" w:themeColor="text1"/>
           <w:sz w:val="26"/>
           <w:szCs w:val="26"/>
         </w:rPr>
@@ -1516,15 +1672,17 @@
       <w:pPr>
         <w:rPr>
           <w:rFonts w:asciiTheme="majorHAnsi" w:hAnsiTheme="majorHAnsi" w:cstheme="majorHAnsi"/>
-          <w:sz w:val="26"/>
-          <w:szCs w:val="26"/>
-        </w:rPr>
-      </w:pPr>
-      <w:r>
-        <w:rPr>
-          <w:rFonts w:asciiTheme="majorHAnsi" w:hAnsiTheme="majorHAnsi" w:cstheme="majorHAnsi"/>
-          <w:b/>
-          <w:bCs/>
+          <w:color w:val="000000" w:themeColor="text1"/>
+          <w:sz w:val="26"/>
+          <w:szCs w:val="26"/>
+        </w:rPr>
+      </w:pPr>
+      <w:r>
+        <w:rPr>
+          <w:rFonts w:asciiTheme="majorHAnsi" w:hAnsiTheme="majorHAnsi" w:cstheme="majorHAnsi"/>
+          <w:b/>
+          <w:bCs/>
+          <w:color w:val="000000" w:themeColor="text1"/>
           <w:sz w:val="26"/>
           <w:szCs w:val="26"/>
         </w:rPr>
@@ -1539,15 +1697,17 @@
         </w:numPr>
         <w:rPr>
           <w:rFonts w:asciiTheme="majorHAnsi" w:hAnsiTheme="majorHAnsi" w:cstheme="majorHAnsi"/>
-          <w:sz w:val="26"/>
-          <w:szCs w:val="26"/>
-        </w:rPr>
-      </w:pPr>
-      <w:r>
-        <w:rPr>
-          <w:rFonts w:asciiTheme="majorHAnsi" w:hAnsiTheme="majorHAnsi" w:cstheme="majorHAnsi"/>
-          <w:b/>
-          <w:bCs/>
+          <w:color w:val="000000" w:themeColor="text1"/>
+          <w:sz w:val="26"/>
+          <w:szCs w:val="26"/>
+        </w:rPr>
+      </w:pPr>
+      <w:r>
+        <w:rPr>
+          <w:rFonts w:asciiTheme="majorHAnsi" w:hAnsiTheme="majorHAnsi" w:cstheme="majorHAnsi"/>
+          <w:b/>
+          <w:bCs/>
+          <w:color w:val="000000" w:themeColor="text1"/>
           <w:sz w:val="26"/>
           <w:szCs w:val="26"/>
         </w:rPr>
@@ -1559,15 +1719,17 @@
         <w:ind w:left="993"/>
         <w:rPr>
           <w:rFonts w:asciiTheme="majorHAnsi" w:hAnsiTheme="majorHAnsi" w:cstheme="majorHAnsi"/>
-          <w:sz w:val="26"/>
-          <w:szCs w:val="26"/>
-        </w:rPr>
-      </w:pPr>
-      <w:r>
-        <w:rPr>
-          <w:rFonts w:asciiTheme="majorHAnsi" w:hAnsiTheme="majorHAnsi" w:cstheme="majorHAnsi"/>
-          <w:b/>
-          <w:bCs/>
+          <w:color w:val="000000" w:themeColor="text1"/>
+          <w:sz w:val="26"/>
+          <w:szCs w:val="26"/>
+        </w:rPr>
+      </w:pPr>
+      <w:r>
+        <w:rPr>
+          <w:rFonts w:asciiTheme="majorHAnsi" w:hAnsiTheme="majorHAnsi" w:cstheme="majorHAnsi"/>
+          <w:b/>
+          <w:bCs/>
+          <w:color w:val="000000" w:themeColor="text1"/>
           <w:sz w:val="26"/>
           <w:szCs w:val="26"/>
         </w:rPr>
@@ -1576,6 +1738,7 @@
       <w:r>
         <w:rPr>
           <w:rFonts w:asciiTheme="majorHAnsi" w:hAnsiTheme="majorHAnsi" w:cstheme="majorHAnsi"/>
+          <w:color w:val="000000" w:themeColor="text1"/>
           <w:sz w:val="26"/>
           <w:szCs w:val="26"/>
         </w:rPr>
@@ -1587,15 +1750,17 @@
         <w:ind w:left="993"/>
         <w:rPr>
           <w:rFonts w:asciiTheme="majorHAnsi" w:hAnsiTheme="majorHAnsi" w:cstheme="majorHAnsi"/>
-          <w:sz w:val="26"/>
-          <w:szCs w:val="26"/>
-        </w:rPr>
-      </w:pPr>
-      <w:r>
-        <w:rPr>
-          <w:rFonts w:asciiTheme="majorHAnsi" w:hAnsiTheme="majorHAnsi" w:cstheme="majorHAnsi"/>
-          <w:b/>
-          <w:bCs/>
+          <w:color w:val="000000" w:themeColor="text1"/>
+          <w:sz w:val="26"/>
+          <w:szCs w:val="26"/>
+        </w:rPr>
+      </w:pPr>
+      <w:r>
+        <w:rPr>
+          <w:rFonts w:asciiTheme="majorHAnsi" w:hAnsiTheme="majorHAnsi" w:cstheme="majorHAnsi"/>
+          <w:b/>
+          <w:bCs/>
+          <w:color w:val="000000" w:themeColor="text1"/>
           <w:sz w:val="26"/>
           <w:szCs w:val="26"/>
         </w:rPr>
@@ -1607,17 +1772,18 @@
         <w:ind w:left="1701"/>
         <w:rPr>
           <w:rFonts w:asciiTheme="majorHAnsi" w:hAnsiTheme="majorHAnsi" w:cstheme="majorHAnsi"/>
-          <w:sz w:val="26"/>
-          <w:szCs w:val="26"/>
-        </w:rPr>
-      </w:pPr>
-      <w:r>
-        <w:rPr>
-          <w:rFonts w:asciiTheme="majorHAnsi" w:hAnsiTheme="majorHAnsi" w:cstheme="majorHAnsi"/>
-          <w:sz w:val="26"/>
-          <w:szCs w:val="26"/>
-        </w:rPr>
-        <w:lastRenderedPageBreak/>
+          <w:color w:val="000000" w:themeColor="text1"/>
+          <w:sz w:val="26"/>
+          <w:szCs w:val="26"/>
+        </w:rPr>
+      </w:pPr>
+      <w:r>
+        <w:rPr>
+          <w:rFonts w:asciiTheme="majorHAnsi" w:hAnsiTheme="majorHAnsi" w:cstheme="majorHAnsi"/>
+          <w:color w:val="000000" w:themeColor="text1"/>
+          <w:sz w:val="26"/>
+          <w:szCs w:val="26"/>
+        </w:rPr>
         <w:t xml:space="preserve">- </w:t>
       </w:r>
       <w:r>
@@ -1625,6 +1791,7 @@
           <w:rFonts w:asciiTheme="majorHAnsi" w:hAnsiTheme="majorHAnsi" w:cstheme="majorHAnsi"/>
           <w:b/>
           <w:bCs/>
+          <w:color w:val="000000" w:themeColor="text1"/>
           <w:sz w:val="26"/>
           <w:szCs w:val="26"/>
         </w:rPr>
@@ -1633,6 +1800,7 @@
       <w:r>
         <w:rPr>
           <w:rFonts w:asciiTheme="majorHAnsi" w:hAnsiTheme="majorHAnsi" w:cstheme="majorHAnsi"/>
+          <w:color w:val="000000" w:themeColor="text1"/>
           <w:sz w:val="26"/>
           <w:szCs w:val="26"/>
         </w:rPr>
@@ -1644,13 +1812,15 @@
         <w:ind w:left="1701"/>
         <w:rPr>
           <w:rFonts w:asciiTheme="majorHAnsi" w:hAnsiTheme="majorHAnsi" w:cstheme="majorHAnsi"/>
-          <w:sz w:val="26"/>
-          <w:szCs w:val="26"/>
-        </w:rPr>
-      </w:pPr>
-      <w:r>
-        <w:rPr>
-          <w:rFonts w:asciiTheme="majorHAnsi" w:hAnsiTheme="majorHAnsi" w:cstheme="majorHAnsi"/>
+          <w:color w:val="000000" w:themeColor="text1"/>
+          <w:sz w:val="26"/>
+          <w:szCs w:val="26"/>
+        </w:rPr>
+      </w:pPr>
+      <w:r>
+        <w:rPr>
+          <w:rFonts w:asciiTheme="majorHAnsi" w:hAnsiTheme="majorHAnsi" w:cstheme="majorHAnsi"/>
+          <w:color w:val="000000" w:themeColor="text1"/>
           <w:sz w:val="26"/>
           <w:szCs w:val="26"/>
         </w:rPr>
@@ -1661,6 +1831,7 @@
           <w:rFonts w:asciiTheme="majorHAnsi" w:hAnsiTheme="majorHAnsi" w:cstheme="majorHAnsi"/>
           <w:b/>
           <w:bCs/>
+          <w:color w:val="000000" w:themeColor="text1"/>
           <w:sz w:val="26"/>
           <w:szCs w:val="26"/>
         </w:rPr>
@@ -1669,6 +1840,7 @@
       <w:r>
         <w:rPr>
           <w:rFonts w:asciiTheme="majorHAnsi" w:hAnsiTheme="majorHAnsi" w:cstheme="majorHAnsi"/>
+          <w:color w:val="000000" w:themeColor="text1"/>
           <w:sz w:val="26"/>
           <w:szCs w:val="26"/>
         </w:rPr>
@@ -1680,13 +1852,15 @@
         <w:ind w:left="1701"/>
         <w:rPr>
           <w:rFonts w:asciiTheme="majorHAnsi" w:hAnsiTheme="majorHAnsi" w:cstheme="majorHAnsi"/>
-          <w:sz w:val="26"/>
-          <w:szCs w:val="26"/>
-        </w:rPr>
-      </w:pPr>
-      <w:r>
-        <w:rPr>
-          <w:rFonts w:asciiTheme="majorHAnsi" w:hAnsiTheme="majorHAnsi" w:cstheme="majorHAnsi"/>
+          <w:color w:val="000000" w:themeColor="text1"/>
+          <w:sz w:val="26"/>
+          <w:szCs w:val="26"/>
+        </w:rPr>
+      </w:pPr>
+      <w:r>
+        <w:rPr>
+          <w:rFonts w:asciiTheme="majorHAnsi" w:hAnsiTheme="majorHAnsi" w:cstheme="majorHAnsi"/>
+          <w:color w:val="000000" w:themeColor="text1"/>
           <w:sz w:val="26"/>
           <w:szCs w:val="26"/>
         </w:rPr>
@@ -1697,6 +1871,7 @@
           <w:rFonts w:asciiTheme="majorHAnsi" w:hAnsiTheme="majorHAnsi" w:cstheme="majorHAnsi"/>
           <w:b/>
           <w:bCs/>
+          <w:color w:val="000000" w:themeColor="text1"/>
           <w:sz w:val="26"/>
           <w:szCs w:val="26"/>
         </w:rPr>
@@ -1705,6 +1880,7 @@
       <w:r>
         <w:rPr>
           <w:rFonts w:asciiTheme="majorHAnsi" w:hAnsiTheme="majorHAnsi" w:cstheme="majorHAnsi"/>
+          <w:color w:val="000000" w:themeColor="text1"/>
           <w:sz w:val="26"/>
           <w:szCs w:val="26"/>
         </w:rPr>
@@ -1716,15 +1892,17 @@
         <w:ind w:left="993"/>
         <w:rPr>
           <w:rFonts w:asciiTheme="majorHAnsi" w:hAnsiTheme="majorHAnsi" w:cstheme="majorHAnsi"/>
-          <w:sz w:val="26"/>
-          <w:szCs w:val="26"/>
-        </w:rPr>
-      </w:pPr>
-      <w:r>
-        <w:rPr>
-          <w:rFonts w:asciiTheme="majorHAnsi" w:hAnsiTheme="majorHAnsi" w:cstheme="majorHAnsi"/>
-          <w:b/>
-          <w:bCs/>
+          <w:color w:val="000000" w:themeColor="text1"/>
+          <w:sz w:val="26"/>
+          <w:szCs w:val="26"/>
+        </w:rPr>
+      </w:pPr>
+      <w:r>
+        <w:rPr>
+          <w:rFonts w:asciiTheme="majorHAnsi" w:hAnsiTheme="majorHAnsi" w:cstheme="majorHAnsi"/>
+          <w:b/>
+          <w:bCs/>
+          <w:color w:val="000000" w:themeColor="text1"/>
           <w:sz w:val="26"/>
           <w:szCs w:val="26"/>
         </w:rPr>
@@ -1733,6 +1911,7 @@
       <w:r>
         <w:rPr>
           <w:rFonts w:asciiTheme="majorHAnsi" w:hAnsiTheme="majorHAnsi" w:cstheme="majorHAnsi"/>
+          <w:color w:val="000000" w:themeColor="text1"/>
           <w:sz w:val="26"/>
           <w:szCs w:val="26"/>
         </w:rPr>
@@ -1744,15 +1923,18 @@
         <w:ind w:left="993"/>
         <w:rPr>
           <w:rFonts w:asciiTheme="majorHAnsi" w:hAnsiTheme="majorHAnsi" w:cstheme="majorHAnsi"/>
-          <w:sz w:val="26"/>
-          <w:szCs w:val="26"/>
-        </w:rPr>
-      </w:pPr>
-      <w:r>
-        <w:rPr>
-          <w:rFonts w:asciiTheme="majorHAnsi" w:hAnsiTheme="majorHAnsi" w:cstheme="majorHAnsi"/>
-          <w:b/>
-          <w:bCs/>
+          <w:color w:val="000000" w:themeColor="text1"/>
+          <w:sz w:val="26"/>
+          <w:szCs w:val="26"/>
+          <w:lang w:val="en-US"/>
+        </w:rPr>
+      </w:pPr>
+      <w:r>
+        <w:rPr>
+          <w:rFonts w:asciiTheme="majorHAnsi" w:hAnsiTheme="majorHAnsi" w:cstheme="majorHAnsi"/>
+          <w:b/>
+          <w:bCs/>
+          <w:color w:val="000000" w:themeColor="text1"/>
           <w:sz w:val="26"/>
           <w:szCs w:val="26"/>
         </w:rPr>
@@ -1761,6 +1943,7 @@
       <w:r>
         <w:rPr>
           <w:rFonts w:asciiTheme="majorHAnsi" w:hAnsiTheme="majorHAnsi" w:cstheme="majorHAnsi"/>
+          <w:color w:val="000000" w:themeColor="text1"/>
           <w:sz w:val="26"/>
           <w:szCs w:val="26"/>
         </w:rPr>
@@ -1996,6 +2179,7 @@
           <w:sz w:val="26"/>
           <w:szCs w:val="26"/>
         </w:rPr>
+        <w:lastRenderedPageBreak/>
         <w:t>c) Lưu và Đồng bộ:</w:t>
       </w:r>
       <w:r>
@@ -2065,7 +2249,6 @@
           <w:sz w:val="26"/>
           <w:szCs w:val="26"/>
         </w:rPr>
-        <w:lastRenderedPageBreak/>
         <w:t>- Nếu danh mục đã được sử dụng trong ít nhất 1 hồ sơ KH&amp;CN, hệ thống không cho phép xóa cứng khỏi CSDL để tránh lỗi mồ côi dữ liệu.</w:t>
       </w:r>
     </w:p>
@@ -2227,6 +2410,7 @@
           <w:rFonts w:asciiTheme="majorHAnsi" w:hAnsiTheme="majorHAnsi" w:cstheme="majorHAnsi"/>
           <w:sz w:val="26"/>
           <w:szCs w:val="26"/>
+          <w:lang w:val="en-US"/>
         </w:rPr>
       </w:pPr>
       <w:r>
@@ -2246,6 +2430,74 @@
           <w:szCs w:val="26"/>
         </w:rPr>
         <w:t xml:space="preserve"> Cung cấp danh sách Tạp chí hợp lệ để thuật toán AI đối chiếu. Nếu hồ sơ nộp vào ghi tên một tạp chí nằm ngoài danh mục này, thuật toán ở Nghiệp vụ 6 sẽ tự động đánh cờ cảnh báo "Tạp chí không hợp lệ".</w:t>
+      </w:r>
+    </w:p>
+    <w:p>
+      <w:pPr>
+        <w:ind w:left="993"/>
+        <w:rPr>
+          <w:rFonts w:asciiTheme="majorHAnsi" w:hAnsiTheme="majorHAnsi" w:cstheme="majorHAnsi"/>
+          <w:b/>
+          <w:bCs/>
+          <w:color w:val="C00000"/>
+          <w:sz w:val="26"/>
+          <w:szCs w:val="26"/>
+          <w:lang w:val="en-US"/>
+        </w:rPr>
+      </w:pPr>
+      <w:r>
+        <w:rPr>
+          <w:rFonts w:asciiTheme="majorHAnsi" w:hAnsiTheme="majorHAnsi" w:cstheme="majorHAnsi"/>
+          <w:b/>
+          <w:bCs/>
+          <w:color w:val="C00000"/>
+          <w:sz w:val="26"/>
+          <w:szCs w:val="26"/>
+          <w:lang w:val="en-US"/>
+        </w:rPr>
+        <w:sym w:font="Wingdings" w:char="F0E8"/>
+      </w:r>
+      <w:r>
+        <w:rPr>
+          <w:rFonts w:asciiTheme="majorHAnsi" w:hAnsiTheme="majorHAnsi" w:cstheme="majorHAnsi"/>
+          <w:b/>
+          <w:bCs/>
+          <w:color w:val="C00000"/>
+          <w:sz w:val="26"/>
+          <w:szCs w:val="26"/>
+          <w:lang w:val="en-US"/>
+        </w:rPr>
+        <w:t xml:space="preserve"> </w:t>
+      </w:r>
+      <w:r>
+        <w:rPr>
+          <w:rFonts w:asciiTheme="majorHAnsi" w:hAnsiTheme="majorHAnsi" w:cstheme="majorHAnsi"/>
+          <w:color w:val="C00000"/>
+          <w:sz w:val="26"/>
+          <w:szCs w:val="26"/>
+        </w:rPr>
+        <w:t>Đối với bài báo, cần bổ sung danh mục hội nghị/hội thảo, loại hình công bố, cơ sở dữ liệu chỉ mục và phân loại tạp chí</w:t>
+      </w:r>
+    </w:p>
+    <w:p>
+      <w:pPr>
+        <w:ind w:left="993"/>
+        <w:rPr>
+          <w:rFonts w:asciiTheme="majorHAnsi" w:hAnsiTheme="majorHAnsi" w:cstheme="majorHAnsi"/>
+          <w:color w:val="C00000"/>
+          <w:sz w:val="26"/>
+          <w:szCs w:val="26"/>
+          <w:lang w:val="en-US"/>
+        </w:rPr>
+      </w:pPr>
+      <w:r>
+        <w:rPr>
+          <w:rFonts w:asciiTheme="majorHAnsi" w:hAnsiTheme="majorHAnsi" w:cstheme="majorHAnsi"/>
+          <w:color w:val="C00000"/>
+          <w:sz w:val="26"/>
+          <w:szCs w:val="26"/>
+        </w:rPr>
+        <w:t>Bổ sung danh mục cấp đề tài, loại hình đề tài, trạng thái thực hiện, kết quả đánh giá/nghiệm thu và loại sản phẩm nghiên cứu.</w:t>
       </w:r>
     </w:p>
     <w:p>
@@ -2265,6 +2517,51 @@
           <w:rFonts w:cstheme="majorHAnsi"/>
         </w:rPr>
         <w:t>Nghiệp vụ 3: Quản lý quy trình xét duyệt hồ sơ</w:t>
+      </w:r>
+      <w:r>
+        <w:rPr>
+          <w:rFonts w:cstheme="majorHAnsi"/>
+          <w:lang w:val="en-US"/>
+        </w:rPr>
+        <w:t xml:space="preserve"> </w:t>
+      </w:r>
+      <w:r>
+        <w:rPr>
+          <w:rFonts w:cstheme="majorHAnsi"/>
+          <w:lang w:val="en-US"/>
+        </w:rPr>
+        <w:sym w:font="Wingdings" w:char="F0E8"/>
+      </w:r>
+      <w:r>
+        <w:rPr>
+          <w:rFonts w:cstheme="majorHAnsi"/>
+          <w:lang w:val="en-US"/>
+        </w:rPr>
+        <w:t xml:space="preserve"> </w:t>
+      </w:r>
+      <w:r>
+        <w:rPr>
+          <w:rFonts w:cstheme="majorHAnsi"/>
+          <w:color w:val="C00000"/>
+          <w:lang w:val="en-US"/>
+        </w:rPr>
+        <w:t>Quản lý quy trình kiểm tra tính hợp lệ</w:t>
+      </w:r>
+      <w:r>
+        <w:rPr>
+          <w:rFonts w:cstheme="majorHAnsi"/>
+          <w:color w:val="C00000"/>
+          <w:lang w:val="en-US"/>
+        </w:rPr>
+        <w:t xml:space="preserve"> (xét duyệt để thực hiện khác với xét duyệt </w:t>
+      </w:r>
+      <w:r>
+        <w:rPr>
+          <w:rFonts w:cstheme="majorHAnsi"/>
+          <w:color w:val="C00000"/>
+          <w:lang w:val="en-US"/>
+        </w:rPr>
+        <w:t>tính hợp lệ)</w:t>
       </w:r>
     </w:p>
     <w:p>
@@ -2455,6 +2752,7 @@
           <w:sz w:val="26"/>
           <w:szCs w:val="26"/>
         </w:rPr>
+        <w:lastRenderedPageBreak/>
         <w:t>a) Truy cập hàng đợi:</w:t>
       </w:r>
       <w:r>
@@ -2644,7 +2942,6 @@
           <w:sz w:val="26"/>
           <w:szCs w:val="26"/>
         </w:rPr>
-        <w:lastRenderedPageBreak/>
         <w:t>- Xem kết quả gợi ý nhãn lĩnh vực/loại công trình từ mô-đun AI ở Nghiệp vụ 5.</w:t>
       </w:r>
     </w:p>
@@ -2986,6 +3283,7 @@
           <w:sz w:val="26"/>
           <w:szCs w:val="26"/>
         </w:rPr>
+        <w:lastRenderedPageBreak/>
         <w:t>b) Ràng buộc toàn vẹn:</w:t>
       </w:r>
       <w:r>
@@ -3055,6 +3353,7 @@
           <w:rFonts w:asciiTheme="majorHAnsi" w:hAnsiTheme="majorHAnsi" w:cstheme="majorHAnsi"/>
           <w:sz w:val="26"/>
           <w:szCs w:val="26"/>
+          <w:lang w:val="en-US"/>
         </w:rPr>
       </w:pPr>
       <w:r>
@@ -3075,6 +3374,17 @@
         </w:rPr>
         <w:t xml:space="preserve"> Tác giả đăng nhập vào hệ thống có thể xem ngay trạng thái mới nhất kèm theo ý kiến nhận xét cụ thể từ cán bộ xét duyệt.</w:t>
       </w:r>
+    </w:p>
+    <w:p>
+      <w:pPr>
+        <w:ind w:left="993"/>
+        <w:rPr>
+          <w:rFonts w:asciiTheme="majorHAnsi" w:hAnsiTheme="majorHAnsi" w:cstheme="majorHAnsi"/>
+          <w:sz w:val="26"/>
+          <w:szCs w:val="26"/>
+          <w:lang w:val="en-US"/>
+        </w:rPr>
+      </w:pPr>
     </w:p>
     <w:p>
       <w:pPr>
@@ -3146,7 +3456,6 @@
           <w:sz w:val="26"/>
           <w:szCs w:val="26"/>
         </w:rPr>
-        <w:lastRenderedPageBreak/>
         <w:t>Tác nhân thực hiện:</w:t>
       </w:r>
       <w:r>
@@ -3507,6 +3816,7 @@
           <w:sz w:val="26"/>
           <w:szCs w:val="26"/>
         </w:rPr>
+        <w:lastRenderedPageBreak/>
         <w:t>b) Tổng hợp danh sách:</w:t>
       </w:r>
       <w:r>
@@ -3707,7 +4017,6 @@
           <w:sz w:val="26"/>
           <w:szCs w:val="26"/>
         </w:rPr>
-        <w:lastRenderedPageBreak/>
         <w:t xml:space="preserve">- </w:t>
       </w:r>
       <w:r>
@@ -3871,6 +4180,7 @@
           <w:rFonts w:asciiTheme="majorHAnsi" w:hAnsiTheme="majorHAnsi" w:cstheme="majorHAnsi"/>
           <w:sz w:val="26"/>
           <w:szCs w:val="26"/>
+          <w:lang w:val="en-US"/>
         </w:rPr>
       </w:pPr>
       <w:r>
@@ -3890,6 +4200,127 @@
           <w:szCs w:val="26"/>
         </w:rPr>
         <w:t xml:space="preserve"> Hệ thống biên dịch dữ liệu thành file mẫu tương ứng và tự động tải về thiết bị người dùng.</w:t>
+      </w:r>
+    </w:p>
+    <w:p>
+      <w:pPr>
+        <w:tabs>
+          <w:tab w:val="num" w:pos="1440"/>
+        </w:tabs>
+        <w:ind w:left="993"/>
+        <w:rPr>
+          <w:rFonts w:asciiTheme="majorHAnsi" w:hAnsiTheme="majorHAnsi" w:cstheme="majorHAnsi"/>
+          <w:b/>
+          <w:bCs/>
+          <w:color w:val="C00000"/>
+          <w:sz w:val="26"/>
+          <w:szCs w:val="26"/>
+          <w:lang w:val="en-US"/>
+        </w:rPr>
+      </w:pPr>
+      <w:r>
+        <w:rPr>
+          <w:rFonts w:asciiTheme="majorHAnsi" w:hAnsiTheme="majorHAnsi" w:cstheme="majorHAnsi"/>
+          <w:b/>
+          <w:bCs/>
+          <w:color w:val="C00000"/>
+          <w:sz w:val="26"/>
+          <w:szCs w:val="26"/>
+          <w:lang w:val="en-US"/>
+        </w:rPr>
+        <w:sym w:font="Wingdings" w:char="F0E8"/>
+      </w:r>
+      <w:r>
+        <w:rPr>
+          <w:rFonts w:asciiTheme="majorHAnsi" w:hAnsiTheme="majorHAnsi" w:cstheme="majorHAnsi"/>
+          <w:b/>
+          <w:bCs/>
+          <w:color w:val="C00000"/>
+          <w:sz w:val="26"/>
+          <w:szCs w:val="26"/>
+          <w:lang w:val="en-US"/>
+        </w:rPr>
+        <w:t xml:space="preserve"> </w:t>
+      </w:r>
+      <w:r>
+        <w:rPr>
+          <w:rFonts w:asciiTheme="majorHAnsi" w:hAnsiTheme="majorHAnsi" w:cstheme="majorHAnsi"/>
+          <w:b/>
+          <w:bCs/>
+          <w:color w:val="C00000"/>
+          <w:sz w:val="26"/>
+          <w:szCs w:val="26"/>
+          <w:lang w:val="en-US"/>
+        </w:rPr>
+        <w:t>Chức năng thống kê riêng cho từng nhóm (công bố khoa học và đề tài NCKH)</w:t>
+      </w:r>
+    </w:p>
+    <w:p>
+      <w:pPr>
+        <w:tabs>
+          <w:tab w:val="num" w:pos="1440"/>
+        </w:tabs>
+        <w:ind w:left="993"/>
+        <w:rPr>
+          <w:rFonts w:asciiTheme="majorHAnsi" w:hAnsiTheme="majorHAnsi" w:cstheme="majorHAnsi"/>
+          <w:color w:val="C00000"/>
+          <w:sz w:val="26"/>
+          <w:szCs w:val="26"/>
+          <w:lang w:val="en-US"/>
+        </w:rPr>
+      </w:pPr>
+      <w:r>
+        <w:rPr>
+          <w:rFonts w:asciiTheme="majorHAnsi" w:hAnsiTheme="majorHAnsi" w:cstheme="majorHAnsi"/>
+          <w:color w:val="C00000"/>
+          <w:sz w:val="26"/>
+          <w:szCs w:val="26"/>
+          <w:lang w:val="en-US"/>
+        </w:rPr>
+        <w:t xml:space="preserve">- </w:t>
+      </w:r>
+      <w:r>
+        <w:rPr>
+          <w:rFonts w:asciiTheme="majorHAnsi" w:hAnsiTheme="majorHAnsi" w:cstheme="majorHAnsi"/>
+          <w:color w:val="C00000"/>
+          <w:sz w:val="26"/>
+          <w:szCs w:val="26"/>
+        </w:rPr>
+        <w:t>Đối với bài báo, thống kê theo năm công bố, đơn vị, tác giả, loại hình công bố, chỉ mục và tình trạng xét duyệt.</w:t>
+      </w:r>
+    </w:p>
+    <w:p>
+      <w:pPr>
+        <w:tabs>
+          <w:tab w:val="num" w:pos="1440"/>
+        </w:tabs>
+        <w:ind w:left="993"/>
+        <w:rPr>
+          <w:rFonts w:asciiTheme="majorHAnsi" w:hAnsiTheme="majorHAnsi" w:cstheme="majorHAnsi"/>
+          <w:color w:val="C00000"/>
+          <w:sz w:val="26"/>
+          <w:szCs w:val="26"/>
+          <w:lang w:val="en-US"/>
+        </w:rPr>
+      </w:pPr>
+      <w:r>
+        <w:rPr>
+          <w:rFonts w:asciiTheme="majorHAnsi" w:hAnsiTheme="majorHAnsi" w:cstheme="majorHAnsi"/>
+          <w:color w:val="C00000"/>
+          <w:sz w:val="26"/>
+          <w:szCs w:val="26"/>
+          <w:lang w:val="en-US"/>
+        </w:rPr>
+        <w:t xml:space="preserve">- </w:t>
+      </w:r>
+      <w:r>
+        <w:rPr>
+          <w:rFonts w:asciiTheme="majorHAnsi" w:hAnsiTheme="majorHAnsi" w:cstheme="majorHAnsi"/>
+          <w:color w:val="C00000"/>
+          <w:sz w:val="26"/>
+          <w:szCs w:val="26"/>
+        </w:rPr>
+        <w:t>Đối với đề tài, thống kê theo cấp đề tài, đơn vị chủ trì, chủ nhiệm, năm thực hiện, tiến độ, kinh phí và kết quả nghiệm thu.</w:t>
       </w:r>
     </w:p>
     <w:p>
@@ -3979,6 +4410,7 @@
           <w:sz w:val="26"/>
           <w:szCs w:val="26"/>
         </w:rPr>
+        <w:lastRenderedPageBreak/>
         <w:t>Mô hình ứng dụng:</w:t>
       </w:r>
       <w:r>
@@ -4122,7 +4554,24 @@
           <w:sz w:val="26"/>
           <w:szCs w:val="26"/>
         </w:rPr>
-        <w:t xml:space="preserve"> Hệ thống trích xuất 4 trường thông tin: Tiêu đề + Tóm tắt + Từ khóa + Thông tin tác giả.</w:t>
+        <w:t xml:space="preserve"> Hệ thống trích xuất 4 trường thông tin: Tiêu đề + Tóm tắt + Từ khóa + Thông tin tác giả</w:t>
+      </w:r>
+      <w:r>
+        <w:rPr>
+          <w:rFonts w:asciiTheme="majorHAnsi" w:hAnsiTheme="majorHAnsi" w:cstheme="majorHAnsi"/>
+          <w:sz w:val="26"/>
+          <w:szCs w:val="26"/>
+          <w:lang w:val="en-US"/>
+        </w:rPr>
+        <w:t xml:space="preserve"> </w:t>
+      </w:r>
+      <w:r>
+        <w:rPr>
+          <w:rFonts w:asciiTheme="majorHAnsi" w:hAnsiTheme="majorHAnsi" w:cstheme="majorHAnsi"/>
+          <w:sz w:val="26"/>
+          <w:szCs w:val="26"/>
+        </w:rPr>
+        <w:t>.</w:t>
       </w:r>
     </w:p>
     <w:p>
@@ -4156,31 +4605,7 @@
           <w:szCs w:val="26"/>
           <w:lang w:val="en-US"/>
         </w:rPr>
-        <w:t xml:space="preserve"> </w:t>
-      </w:r>
-      <w:proofErr w:type="spellStart"/>
-      <w:r>
-        <w:rPr>
-          <w:rFonts w:asciiTheme="majorHAnsi" w:hAnsiTheme="majorHAnsi" w:cstheme="majorHAnsi"/>
-          <w:b/>
-          <w:bCs/>
-          <w:sz w:val="26"/>
-          <w:szCs w:val="26"/>
-          <w:lang w:val="en-US"/>
-        </w:rPr>
-        <w:t>và</w:t>
-      </w:r>
-      <w:proofErr w:type="spellEnd"/>
-      <w:r>
-        <w:rPr>
-          <w:rFonts w:asciiTheme="majorHAnsi" w:hAnsiTheme="majorHAnsi" w:cstheme="majorHAnsi"/>
-          <w:b/>
-          <w:bCs/>
-          <w:sz w:val="26"/>
-          <w:szCs w:val="26"/>
-          <w:lang w:val="en-US"/>
-        </w:rPr>
-        <w:t xml:space="preserve"> c</w:t>
+        <w:t xml:space="preserve"> và c</w:t>
       </w:r>
       <w:r>
         <w:rPr>
@@ -4299,7 +4724,6 @@
           <w:sz w:val="26"/>
           <w:szCs w:val="26"/>
         </w:rPr>
-        <w:lastRenderedPageBreak/>
         <w:t>a) Trích xuất đặc trưng &amp; Dự đoán:</w:t>
       </w:r>
       <w:r>
@@ -4623,6 +5047,7 @@
           <w:sz w:val="26"/>
           <w:szCs w:val="26"/>
         </w:rPr>
+        <w:lastRenderedPageBreak/>
         <w:t xml:space="preserve">+ </w:t>
       </w:r>
       <w:r>
@@ -4861,17 +5286,17 @@
           <w:rFonts w:asciiTheme="majorHAnsi" w:hAnsiTheme="majorHAnsi" w:cstheme="majorHAnsi"/>
           <w:sz w:val="26"/>
           <w:szCs w:val="26"/>
-        </w:rPr>
-      </w:pPr>
-      <w:r>
-        <w:rPr>
-          <w:rFonts w:asciiTheme="majorHAnsi" w:hAnsiTheme="majorHAnsi" w:cstheme="majorHAnsi"/>
-          <w:b/>
-          <w:bCs/>
-          <w:sz w:val="26"/>
-          <w:szCs w:val="26"/>
-        </w:rPr>
-        <w:lastRenderedPageBreak/>
+          <w:lang w:val="en-US"/>
+        </w:rPr>
+      </w:pPr>
+      <w:r>
+        <w:rPr>
+          <w:rFonts w:asciiTheme="majorHAnsi" w:hAnsiTheme="majorHAnsi" w:cstheme="majorHAnsi"/>
+          <w:b/>
+          <w:bCs/>
+          <w:sz w:val="26"/>
+          <w:szCs w:val="26"/>
+        </w:rPr>
         <w:t>c) Huấn luyện lại (Re-training):</w:t>
       </w:r>
       <w:r>
@@ -4881,6 +5306,56 @@
           <w:szCs w:val="26"/>
         </w:rPr>
         <w:t xml:space="preserve"> Các hồ sơ bị Cán bộ điều chỉnh nhãn thủ công sẽ được đưa vào tập dữ liệu bổ sung để fine-tune mô hình trong tương lai.</w:t>
+      </w:r>
+    </w:p>
+    <w:p>
+      <w:pPr>
+        <w:tabs>
+          <w:tab w:val="num" w:pos="1440"/>
+        </w:tabs>
+        <w:ind w:left="993"/>
+        <w:rPr>
+          <w:rFonts w:asciiTheme="majorHAnsi" w:hAnsiTheme="majorHAnsi" w:cstheme="majorHAnsi"/>
+          <w:color w:val="C00000"/>
+          <w:sz w:val="26"/>
+          <w:szCs w:val="26"/>
+          <w:lang w:val="en-US"/>
+        </w:rPr>
+      </w:pPr>
+      <w:r>
+        <w:rPr>
+          <w:rFonts w:asciiTheme="majorHAnsi" w:hAnsiTheme="majorHAnsi" w:cstheme="majorHAnsi"/>
+          <w:b/>
+          <w:bCs/>
+          <w:color w:val="C00000"/>
+          <w:sz w:val="26"/>
+          <w:szCs w:val="26"/>
+          <w:lang w:val="en-US"/>
+        </w:rPr>
+        <w:sym w:font="Wingdings" w:char="F0E8"/>
+      </w:r>
+      <w:r>
+        <w:rPr>
+          <w:rFonts w:asciiTheme="majorHAnsi" w:hAnsiTheme="majorHAnsi" w:cstheme="majorHAnsi"/>
+          <w:b/>
+          <w:bCs/>
+          <w:color w:val="C00000"/>
+          <w:sz w:val="26"/>
+          <w:szCs w:val="26"/>
+          <w:lang w:val="en-US"/>
+        </w:rPr>
+        <w:t xml:space="preserve"> </w:t>
+      </w:r>
+      <w:r>
+        <w:rPr>
+          <w:rFonts w:asciiTheme="majorHAnsi" w:hAnsiTheme="majorHAnsi" w:cstheme="majorHAnsi"/>
+          <w:b/>
+          <w:bCs/>
+          <w:color w:val="C00000"/>
+          <w:sz w:val="26"/>
+          <w:szCs w:val="26"/>
+        </w:rPr>
+        <w:t>Xác định dữ liệu đầu vào từng nhóm: tiêu đề, tóm tắt, từ khóa bài báo hoặc tên đề tài, mục tiêu, nội dung nghiên cứu.</w:t>
       </w:r>
     </w:p>
     <w:p>
@@ -5091,6 +5566,7 @@
           <w:sz w:val="26"/>
           <w:szCs w:val="26"/>
         </w:rPr>
+        <w:lastRenderedPageBreak/>
         <w:t>a) Thu thập thông tin hồ sơ:</w:t>
       </w:r>
       <w:r>
@@ -5420,16 +5896,7 @@
           <w:sz w:val="26"/>
           <w:szCs w:val="26"/>
         </w:rPr>
-        <w:t xml:space="preserve"> Đưa biểu diễn văn bản và các đường nối trên đồ thị quan hệ vào mô hình AI. Mô hình phát hiện các điểm dữ liệu cô lập </w:t>
-      </w:r>
-      <w:r>
-        <w:rPr>
-          <w:rFonts w:asciiTheme="majorHAnsi" w:hAnsiTheme="majorHAnsi" w:cstheme="majorHAnsi"/>
-          <w:sz w:val="26"/>
-          <w:szCs w:val="26"/>
-        </w:rPr>
-        <w:lastRenderedPageBreak/>
-        <w:t xml:space="preserve">(outliers) khác biệt bất thường so với tập dữ liệu chuẩn </w:t>
+        <w:t xml:space="preserve"> Đưa biểu diễn văn bản và các đường nối trên đồ thị quan hệ vào mô hình AI. Mô hình phát hiện các điểm dữ liệu cô lập (outliers) khác biệt bất thường so với tập dữ liệu chuẩn </w:t>
       </w:r>
       <m:oMath>
         <m:r>
@@ -5772,6 +6239,7 @@
           <w:sz w:val="26"/>
           <w:szCs w:val="26"/>
         </w:rPr>
+        <w:lastRenderedPageBreak/>
         <w:t>+ [Nghi vấn] Độ trùng lặp nội dung cao.</w:t>
       </w:r>
     </w:p>
@@ -6049,7 +6517,6 @@
           <w:sz w:val="26"/>
           <w:szCs w:val="26"/>
         </w:rPr>
-        <w:lastRenderedPageBreak/>
         <w:t>Tính toàn vẹn lịch sử:</w:t>
       </w:r>
       <w:r>
@@ -6103,7 +6570,7 @@
     </w:p>
     <w:sectPr>
       <w:pgSz w:w="11906" w:h="16838"/>
-      <w:pgMar w:top="1440" w:right="1440" w:bottom="1440" w:left="1440" w:header="708" w:footer="708" w:gutter="0"/>
+      <w:pgMar w:top="1440" w:right="1286" w:bottom="1440" w:left="1440" w:header="708" w:footer="708" w:gutter="0"/>
       <w:cols w:space="708"/>
       <w:docGrid w:linePitch="360"/>
     </w:sectPr>
@@ -7611,7 +8078,7 @@
   <w:abstractNum w:abstractNumId="11" w15:restartNumberingAfterBreak="0">
     <w:nsid w:val="52F11C00"/>
     <w:multiLevelType w:val="multilevel"/>
-    <w:tmpl w:val="C3FE853E"/>
+    <w:tmpl w:val="CDBC2B8E"/>
     <w:lvl w:ilvl="0">
       <w:start w:val="1"/>
       <w:numFmt w:val="bullet"/>
@@ -7628,36 +8095,28 @@
         <w:sz w:val="20"/>
       </w:rPr>
     </w:lvl>
-    <w:lvl w:ilvl="1" w:tentative="1">
-      <w:start w:val="1"/>
-      <w:numFmt w:val="bullet"/>
-      <w:lvlText w:val="o"/>
-      <w:lvlJc w:val="left"/>
-      <w:pPr>
-        <w:tabs>
-          <w:tab w:val="num" w:pos="1080"/>
-        </w:tabs>
+    <w:lvl w:ilvl="1">
+      <w:numFmt w:val="bullet"/>
+      <w:lvlText w:val=""/>
+      <w:lvlJc w:val="left"/>
+      <w:pPr>
         <w:ind w:left="1080" w:hanging="360"/>
       </w:pPr>
       <w:rPr>
-        <w:rFonts w:ascii="Courier New" w:hAnsi="Courier New" w:hint="default"/>
-        <w:sz w:val="20"/>
-      </w:rPr>
-    </w:lvl>
-    <w:lvl w:ilvl="2" w:tentative="1">
-      <w:start w:val="1"/>
-      <w:numFmt w:val="bullet"/>
-      <w:lvlText w:val=""/>
-      <w:lvlJc w:val="left"/>
-      <w:pPr>
-        <w:tabs>
-          <w:tab w:val="num" w:pos="1800"/>
-        </w:tabs>
+        <w:rFonts w:ascii="Wingdings" w:eastAsiaTheme="minorHAnsi" w:hAnsi="Wingdings" w:cstheme="majorHAnsi" w:hint="default"/>
+        <w:b/>
+        <w:color w:val="EE0000"/>
+      </w:rPr>
+    </w:lvl>
+    <w:lvl w:ilvl="2">
+      <w:numFmt w:val="bullet"/>
+      <w:lvlText w:val="-"/>
+      <w:lvlJc w:val="left"/>
+      <w:pPr>
         <w:ind w:left="1800" w:hanging="360"/>
       </w:pPr>
       <w:rPr>
-        <w:rFonts w:ascii="Wingdings" w:hAnsi="Wingdings" w:hint="default"/>
-        <w:sz w:val="20"/>
+        <w:rFonts w:ascii="Times New Roman" w:eastAsiaTheme="minorHAnsi" w:hAnsi="Times New Roman" w:cs="Times New Roman" w:hint="default"/>
       </w:rPr>
     </w:lvl>
     <w:lvl w:ilvl="3" w:tentative="1">
@@ -9392,6 +9851,17 @@
       <w:color w:val="666666"/>
     </w:rPr>
   </w:style>
+  <w:style w:type="paragraph" w:styleId="NormalWeb">
+    <w:name w:val="Normal (Web)"/>
+    <w:basedOn w:val="Normal"/>
+    <w:uiPriority w:val="99"/>
+    <w:semiHidden/>
+    <w:unhideWhenUsed/>
+    <w:rsid w:val="003B6FEE"/>
+    <w:rPr>
+      <w:rFonts w:ascii="Times New Roman" w:hAnsi="Times New Roman" w:cs="Times New Roman"/>
+    </w:rPr>
+  </w:style>
 </w:styles>
 </file>
 

</xml_diff>